<commit_message>
Share identity between resume and letters; add letter scaffolding
shared/profile.js is now the single source for name, title, and contact.
Both the resume and every cover letter spread it, so a changed phone
number or profile URL updates both.

new-letter.sh scaffolds a dated, company-named folder with a content.js
and a job-description.md to paste the posting into, which also leaves a
record of what each letter was written against.

Co-Authored-By: Claude Opus 5 <noreply@anthropic.com>
</commit_message>
<xml_diff>
--- a/resume/2026-08-26/travis-hoki-resume-2026-08-26.docx
+++ b/resume/2026-08-26/travis-hoki-resume-2026-08-26.docx
@@ -58,7 +58,7 @@
         </w:rPr>
         <w:t xml:space="preserve">  |  </w:t>
       </w:r>
-      <w:hyperlink w:history="1" r:id="rIdtgrzwbbqxe5umi3oexfw7">
+      <w:hyperlink w:history="1" r:id="rIdfxhx6aimiidf9udosyt63">
         <w:r>
           <w:rPr>
             <w:rFonts w:ascii="Arial" w:cs="Arial" w:eastAsia="Arial" w:hAnsi="Arial"/>
@@ -77,7 +77,7 @@
         </w:rPr>
         <w:t xml:space="preserve">  |  </w:t>
       </w:r>
-      <w:hyperlink w:history="1" r:id="rIdt1ralf7kil47bu7d33rrr">
+      <w:hyperlink w:history="1" r:id="rIdrdmtafjlv0dlukfiujpj9">
         <w:r>
           <w:rPr>
             <w:rFonts w:ascii="Arial" w:cs="Arial" w:eastAsia="Arial" w:hAnsi="Arial"/>
@@ -95,7 +95,7 @@
         <w:spacing w:after="160" w:line="240" w:lineRule="auto"/>
         <w:jc w:val="center"/>
       </w:pPr>
-      <w:hyperlink w:history="1" r:id="rIdmqaq6o6geupwj2-fc2lml">
+      <w:hyperlink w:history="1" r:id="rIdxqq94hwjzmbsinihg3xwv">
         <w:r>
           <w:rPr>
             <w:rFonts w:ascii="Arial" w:cs="Arial" w:eastAsia="Arial" w:hAnsi="Arial"/>
@@ -114,7 +114,7 @@
         </w:rPr>
         <w:t xml:space="preserve">  |  </w:t>
       </w:r>
-      <w:hyperlink w:history="1" r:id="rIdjw5m24slvt86bsvag6cbr">
+      <w:hyperlink w:history="1" r:id="rIdxioowoiq-wp2q20j6isnx">
         <w:r>
           <w:rPr>
             <w:rFonts w:ascii="Arial" w:cs="Arial" w:eastAsia="Arial" w:hAnsi="Arial"/>
@@ -133,7 +133,7 @@
         </w:rPr>
         <w:t xml:space="preserve">  |  </w:t>
       </w:r>
-      <w:hyperlink w:history="1" r:id="rIdkoq77jylkgmd_uzbhlage">
+      <w:hyperlink w:history="1" r:id="rIdcmxsuxuci1m0hfzzqzkfi">
         <w:r>
           <w:rPr>
             <w:rFonts w:ascii="Arial" w:cs="Arial" w:eastAsia="Arial" w:hAnsi="Arial"/>
@@ -1275,7 +1275,7 @@
         <w:pStyle w:val="Normal"/>
         <w:spacing w:after="20" w:before="120" w:line="240" w:lineRule="auto"/>
       </w:pPr>
-      <w:hyperlink w:history="1" r:id="rIdyot7qgbtnfa7xpxudt3j_">
+      <w:hyperlink w:history="1" r:id="rId-zynkuqfudzqaeutkge1m">
         <w:r>
           <w:rPr>
             <w:rFonts w:ascii="Arial" w:cs="Arial" w:eastAsia="Arial" w:hAnsi="Arial"/>
@@ -1308,7 +1308,7 @@
         </w:rPr>
         <w:t xml:space="preserve">  |  </w:t>
       </w:r>
-      <w:hyperlink w:history="1" r:id="rIde7q04uf916octw3yjukme">
+      <w:hyperlink w:history="1" r:id="rIdvwm1scil3geniaju2oid5">
         <w:r>
           <w:rPr>
             <w:rFonts w:ascii="Arial" w:cs="Arial" w:eastAsia="Arial" w:hAnsi="Arial"/>
@@ -1339,7 +1339,7 @@
         <w:pStyle w:val="Normal"/>
         <w:spacing w:after="20" w:before="120" w:line="240" w:lineRule="auto"/>
       </w:pPr>
-      <w:hyperlink w:history="1" r:id="rIdlz_frow7jwgo8wpldmjwq">
+      <w:hyperlink w:history="1" r:id="rId66rau7lpqw_rf2hfz7b01">
         <w:r>
           <w:rPr>
             <w:rFonts w:ascii="Arial" w:cs="Arial" w:eastAsia="Arial" w:hAnsi="Arial"/>
@@ -1372,7 +1372,7 @@
         </w:rPr>
         <w:t xml:space="preserve">  |  </w:t>
       </w:r>
-      <w:hyperlink w:history="1" r:id="rId8nsxj88uv7uvc4dhjmifm">
+      <w:hyperlink w:history="1" r:id="rIdj7eb9w2ugb4k1h8ek9qiq">
         <w:r>
           <w:rPr>
             <w:rFonts w:ascii="Arial" w:cs="Arial" w:eastAsia="Arial" w:hAnsi="Arial"/>
@@ -1403,7 +1403,7 @@
         <w:pStyle w:val="Normal"/>
         <w:spacing w:after="20" w:before="120" w:line="240" w:lineRule="auto"/>
       </w:pPr>
-      <w:hyperlink w:history="1" r:id="rIdnurgv500gapy92erfb6mu">
+      <w:hyperlink w:history="1" r:id="rIdrraeqynncasy5j1eogw8z">
         <w:r>
           <w:rPr>
             <w:rFonts w:ascii="Arial" w:cs="Arial" w:eastAsia="Arial" w:hAnsi="Arial"/>
@@ -1436,7 +1436,7 @@
         </w:rPr>
         <w:t xml:space="preserve">  |  </w:t>
       </w:r>
-      <w:hyperlink w:history="1" r:id="rIdbfieimmdtisr9ujeilyl5">
+      <w:hyperlink w:history="1" r:id="rIdtrwfpprk5rvkpfkloiif7">
         <w:r>
           <w:rPr>
             <w:rFonts w:ascii="Arial" w:cs="Arial" w:eastAsia="Arial" w:hAnsi="Arial"/>
@@ -1461,7 +1461,7 @@
         </w:rPr>
         <w:t xml:space="preserve">Designed, illustrated, and built a mobile game in React Native, shipping one codebase to iOS and Android as real native UI. Published on the </w:t>
       </w:r>
-      <w:hyperlink w:history="1" r:id="rIdvyprm7lyvzhexc7ws8zf1">
+      <w:hyperlink w:history="1" r:id="rId3ehs9ob93glmnftzorgki">
         <w:r>
           <w:rPr>
             <w:rFonts w:ascii="Arial" w:cs="Arial" w:eastAsia="Arial" w:hAnsi="Arial"/>
@@ -1599,7 +1599,7 @@
         <w:pStyle w:val="Normal"/>
         <w:spacing w:after="20" w:before="120" w:line="240" w:lineRule="auto"/>
       </w:pPr>
-      <w:hyperlink w:history="1" r:id="rIdrgb8vxolkiselkw_sgsru">
+      <w:hyperlink w:history="1" r:id="rIdiremkjcsjftqh_3o8dwsb">
         <w:r>
           <w:rPr>
             <w:rFonts w:ascii="Arial" w:cs="Arial" w:eastAsia="Arial" w:hAnsi="Arial"/>
@@ -1632,7 +1632,7 @@
         </w:rPr>
         <w:t xml:space="preserve">  |  </w:t>
       </w:r>
-      <w:hyperlink w:history="1" r:id="rIdu_e9enq3uxulxnimx3-c_">
+      <w:hyperlink w:history="1" r:id="rIddg9cv3xdehknjb18usgwb">
         <w:r>
           <w:rPr>
             <w:rFonts w:ascii="Arial" w:cs="Arial" w:eastAsia="Arial" w:hAnsi="Arial"/>

</xml_diff>